<commit_message>
docs(report): regenerate project report with live rule count (19, not 18)
The tracked .docx predated the rule-count fix, so it still said '18 rule engine'
and 'alerts.py (draft)'. Regenerated from the YAML-driven builder so the committed
artifact matches the code and README.
</commit_message>
<xml_diff>
--- a/reports/SOC-ify_Project_Report.docx
+++ b/reports/SOC-ify_Project_Report.docx
@@ -138,7 +138,7 @@
         <w:pStyle w:val="ListBullet"/>
       </w:pPr>
       <w:r>
-        <w:t>scripts/apply_rules.py (chạy định kỳ ~10 phút) quét các nguồn, gắn rule ID (R-001…R-018 = 18 rule), ghi findings vào index siem-findings — với key {rule, src_ip, window} ổn định để khử trùng lặp.</w:t>
+        <w:t>scripts/apply_rules.py (chạy định kỳ ~10 phút) quét các nguồn, gắn rule ID (R-001…R-019 = 19 rule), ghi findings vào index siem-findings — với key {rule, src_ip, window} ổn định để khử trùng lặp.</w:t>
       </w:r>
     </w:p>
     <w:p>
@@ -189,7 +189,7 @@
         <w:pStyle w:val="ListBullet"/>
       </w:pPr>
       <w:r>
-        <w:t>18 detection rules kiểu Sigma, ánh xạ MITRE ATT&amp;CK.</w:t>
+        <w:t>19 detection rules kiểu Sigma, ánh xạ MITRE ATT&amp;CK.</w:t>
       </w:r>
     </w:p>
     <w:p>
@@ -248,7 +248,7 @@
         <w:rPr>
           <w:color w:val="1F3A5F"/>
         </w:rPr>
-        <w:t>4. Detection Rules (R-001…R-018)</w:t>
+        <w:t>4. Detection Rules (R-001…R-019)</w:t>
       </w:r>
     </w:p>
     <w:p>
@@ -256,7 +256,7 @@
         <w:rPr>
           <w:b w:val="0"/>
         </w:rPr>
-        <w:t>18 rule bao phủ từ chữ ký đơn-request đến tương quan tần suất, chuỗi tấn công, đa nguồn và FIM endpoint. Tất cả ánh xạ MITRE ATT&amp;CK.</w:t>
+        <w:t>19 rule bao phủ từ chữ ký đơn-request đến tương quan tần suất, chuỗi tấn công, đa nguồn và FIM endpoint. Tất cả ánh xạ MITRE ATT&amp;CK.</w:t>
       </w:r>
     </w:p>
     <w:tbl>
@@ -1276,6 +1276,56 @@
           </w:p>
         </w:tc>
       </w:tr>
+      <w:tr>
+        <w:tc>
+          <w:tcPr>
+            <w:tcW w:type="dxa" w:w="1728"/>
+          </w:tcPr>
+          <w:p>
+            <w:r>
+              <w:t>R-019</w:t>
+            </w:r>
+          </w:p>
+        </w:tc>
+        <w:tc>
+          <w:tcPr>
+            <w:tcW w:type="dxa" w:w="1728"/>
+          </w:tcPr>
+          <w:p>
+            <w:r>
+              <w:t>AIDE File Integrity Change - Sensitive Linux Path</w:t>
+            </w:r>
+          </w:p>
+        </w:tc>
+        <w:tc>
+          <w:tcPr>
+            <w:tcW w:type="dxa" w:w="1728"/>
+          </w:tcPr>
+          <w:p>
+            <w:r>
+              <w:t>HIGH</w:t>
+            </w:r>
+          </w:p>
+        </w:tc>
+        <w:tc>
+          <w:tcPr>
+            <w:tcW w:type="dxa" w:w="1728"/>
+          </w:tcPr>
+          <w:p>
+            <w:r>
+              <w:t>file_integrity</w:t>
+            </w:r>
+          </w:p>
+        </w:tc>
+        <w:tc>
+          <w:tcPr>
+            <w:tcW w:type="dxa" w:w="1728"/>
+          </w:tcPr>
+          <w:p>
+            <w:r/>
+          </w:p>
+        </w:tc>
+      </w:tr>
     </w:tbl>
     <w:p>
       <w:r>
@@ -1383,7 +1433,7 @@
         <w:pStyle w:val="ListBullet"/>
       </w:pPr>
       <w:r>
-        <w:t>rules/detection-rules.yaml — 18 rule Sigma-style</w:t>
+        <w:t>rules/detection-rules.yaml — 19 rule Sigma-style</w:t>
       </w:r>
     </w:p>
     <w:p>
@@ -1399,7 +1449,7 @@
         <w:pStyle w:val="ListBullet"/>
       </w:pPr>
       <w:r>
-        <w:t>scripts/ — deploy.sh, apply_rules.py, triage.py, daily_report.py, build_dashboard.py, alerts.py (draft), build_project_report.py, apply_rules (18 rule engine), enable_file_integrity_audit.ps1</w:t>
+        <w:t>scripts/ — deploy.sh, apply_rules.py, triage.py, daily_report.py, build_dashboard.py, alerts.py, build_project_report.py, apply_rules (19 rule engine), response_fim.py, capture_dashboard.py, enable_file_integrity_audit.ps1</w:t>
       </w:r>
     </w:p>
     <w:p>
@@ -1493,7 +1543,7 @@
         <w:rPr>
           <w:b w:val="0"/>
         </w:rPr>
-        <w:t>SOC-ify hoàn thành mục tiêu là một SOC thu nhỏ dạy được và có thể tái tạo trên Azure + Elasticsearch 8.12 + Kibana, không phụ thuộc giấy phép trả phí. Hệ thống đi từ phát hiện (18 rule: nginx web + UFW/SSH đa nguồn + Windows FIM) đến triage và báo cáo, là nền tảng học SIEM/SOC và portfolio công việc vững chắc. Không phải SIEM sản xuất thương mại.</w:t>
+        <w:t>SOC-ify hoàn thành mục tiêu là một SOC thu nhỏ dạy được và có thể tái tạo trên Azure + Elasticsearch 8.12 + Kibana, không phụ thuộc giấy phép trả phí. Hệ thống đi từ phát hiện (19 rule: nginx web + UFW/SSH đa nguồn + Windows FIM) đến triage và báo cáo, là nền tảng học SIEM/SOC và portfolio công việc vững chắc. Không phải SIEM sản xuất thương mại.</w:t>
       </w:r>
     </w:p>
     <w:sectPr>

</xml_diff>